<commit_message>
feat: payments portfolio live + remove in-progress certs + interactivity
- Add live dashboards: /inclusion-financiera/ and /churn-fintech/ (self-contained, bilingual)
- Portfolio: BCRP, Inclusion, Churn, Latrue all Live
- Remove in-progress certifications (PL-300, GA4, AWS DEA-C01); adjust profile wording
- Add interactivity: scroll-progress bar, nav scrollspy, card spotlight, skill-tag hover
- Untrack marca/ (internal brand material) via .gitignore

Co-Authored-By: Claude Opus 4.8 <noreply@anthropic.com>
</commit_message>
<xml_diff>
--- a/Carlo Rondon CV ES.docx
+++ b/Carlo Rondon CV ES.docx
@@ -76,7 +76,7 @@
           <w:color w:val="222233"/>
           <w:sz w:val="20"/>
         </w:rPr>
-        <w:t>En payments es donde me he hecho un nombre. Escalé una fintech de pagos de menos de 100 comercios a más de 40,000, elevé la conversión de comercios de 2% a 8%, optimicé el pricing y las promociones de un negocio de payments con más de 20,000 clientes activos y hoy comercializo las APIs de conectividad bancaria que mueven el dinero corporativo en tiempo real. Combino esa trayectoria comercial con un diferenciador técnico —arquitectura de datos, modelos de pricing, automatización con IA y el stack detrás (SQL, Python, cloud, APIs, LLMs)— así que no solo ejecuto estrategia de payments: la construyo. Más de seis años entre fintech, banca y consultoría, postgrado en management y certificaciones en ciencia de datos e ingeniería de datos en AWS. Mi foco ahora es la próxima frontera de los pagos en Latinoamérica: dinero más rápido, pricing más inteligente y productos que escalan.</w:t>
+        <w:t>En payments es donde me he hecho un nombre. Escalé una fintech de pagos de menos de 100 comercios a más de 40,000, elevé la conversión de comercios de 2% a 8%, optimicé el pricing y las promociones de un negocio de payments con más de 20,000 clientes activos y hoy comercializo las APIs de conectividad bancaria que mueven el dinero corporativo en tiempo real. Combino esa trayectoria comercial con un diferenciador técnico —arquitectura de datos, modelos de pricing, automatización con IA y el stack detrás (SQL, Python, cloud, APIs, LLMs)— así que no solo ejecuto estrategia de payments: la construyo. Más de seis años entre fintech, banca y consultoría, postgrado en management y certificaciones en ciencia de datos y analítica en la nube. Mi foco ahora es la próxima frontera de los pagos en Latinoamérica: dinero más rápido, pricing más inteligente y productos que escalan.</w:t>
       </w:r>
     </w:p>
     <w:p>
@@ -2114,111 +2114,6 @@
     </w:p>
     <w:p>
       <w:pPr>
-        <w:spacing w:before="60" w:after="20"/>
-      </w:pPr>
-      <w:r>
-        <w:rPr>
-          <w:rFonts w:ascii="Calibri" w:hAnsi="Calibri"/>
-          <w:b/>
-          <w:i w:val="0"/>
-          <w:color w:val="B45E09"/>
-          <w:sz w:val="18"/>
-        </w:rPr>
-        <w:t xml:space="preserve">[En curso]  </w:t>
-      </w:r>
-      <w:r>
-        <w:rPr>
-          <w:rFonts w:ascii="Calibri" w:hAnsi="Calibri"/>
-          <w:b/>
-          <w:i w:val="0"/>
-          <w:color w:val="0A0A0A"/>
-          <w:sz w:val="20"/>
-        </w:rPr>
-        <w:t>Microsoft PL-300 · Power BI Data Analyst Associate</w:t>
-      </w:r>
-      <w:r>
-        <w:rPr>
-          <w:rFonts w:ascii="Calibri" w:hAnsi="Calibri"/>
-          <w:b w:val="0"/>
-          <w:i w:val="0"/>
-          <w:color w:val="555566"/>
-          <w:sz w:val="18"/>
-        </w:rPr>
-        <w:t xml:space="preserve">  —  Microsoft · 2025</w:t>
-      </w:r>
-    </w:p>
-    <w:p>
-      <w:pPr>
-        <w:spacing w:before="60" w:after="20"/>
-      </w:pPr>
-      <w:r>
-        <w:rPr>
-          <w:rFonts w:ascii="Calibri" w:hAnsi="Calibri"/>
-          <w:b/>
-          <w:i w:val="0"/>
-          <w:color w:val="B45E09"/>
-          <w:sz w:val="18"/>
-        </w:rPr>
-        <w:t xml:space="preserve">[En curso]  </w:t>
-      </w:r>
-      <w:r>
-        <w:rPr>
-          <w:rFonts w:ascii="Calibri" w:hAnsi="Calibri"/>
-          <w:b/>
-          <w:i w:val="0"/>
-          <w:color w:val="0A0A0A"/>
-          <w:sz w:val="20"/>
-        </w:rPr>
-        <w:t>Google Analytics 4</w:t>
-      </w:r>
-      <w:r>
-        <w:rPr>
-          <w:rFonts w:ascii="Calibri" w:hAnsi="Calibri"/>
-          <w:b w:val="0"/>
-          <w:i w:val="0"/>
-          <w:color w:val="555566"/>
-          <w:sz w:val="18"/>
-        </w:rPr>
-        <w:t xml:space="preserve">  —  Google Skillshop · 2025</w:t>
-      </w:r>
-    </w:p>
-    <w:p>
-      <w:pPr>
-        <w:spacing w:before="60" w:after="20"/>
-      </w:pPr>
-      <w:r>
-        <w:rPr>
-          <w:rFonts w:ascii="Calibri" w:hAnsi="Calibri"/>
-          <w:b/>
-          <w:i w:val="0"/>
-          <w:color w:val="B45E09"/>
-          <w:sz w:val="18"/>
-        </w:rPr>
-        <w:t xml:space="preserve">[En curso]  </w:t>
-      </w:r>
-      <w:r>
-        <w:rPr>
-          <w:rFonts w:ascii="Calibri" w:hAnsi="Calibri"/>
-          <w:b/>
-          <w:i w:val="0"/>
-          <w:color w:val="0A0A0A"/>
-          <w:sz w:val="20"/>
-        </w:rPr>
-        <w:t>AWS Certified Data Engineer – Associate (DEA-C01)</w:t>
-      </w:r>
-      <w:r>
-        <w:rPr>
-          <w:rFonts w:ascii="Calibri" w:hAnsi="Calibri"/>
-          <w:b w:val="0"/>
-          <w:i w:val="0"/>
-          <w:color w:val="555566"/>
-          <w:sz w:val="18"/>
-        </w:rPr>
-        <w:t xml:space="preserve">  —  Amazon · 2025</w:t>
-      </w:r>
-    </w:p>
-    <w:p>
-      <w:pPr>
         <w:spacing w:before="280" w:after="80"/>
         <w:pBdr>
           <w:bottom w:val="single" w:sz="4" w:space="4" w:color="DDDDDD"/>

</xml_diff>